<commit_message>
feat: add hairdresser and sales management functionality
- Created Hairdresser model and schema for managing hairdresser data.
- Implemented HairdresserSale model to track sales associated with hairdressers.
- Developed routes for CRUD operations on hairdressers and their sales.
- Added API integration for hairdresser management in the frontend.
- Implemented EmployeeDetailPage and EmployeesPage for employee management.
- Created HairdresserDetailPage and HairdressersPage for hairdresser management.
- Added modals for editing hairdresser details and adding sales/payments.
- Implemented monthly summary reports for employees and hairdressers.
</commit_message>
<xml_diff>
--- a/שיהיה אפשרות עדכון מהלוח שנה וגם מהכרטיס לקוחה את כל הפרטים.docx
+++ b/שיהיה אפשרות עדכון מהלוח שנה וגם מהכרטיס לקוחה את כל הפרטים.docx
@@ -10,6 +10,13 @@
       </w:pPr>
       <w:r>
         <w:rPr>
+          <w:rFonts w:hint="cs"/>
+          <w:rtl/>
+        </w:rPr>
+        <w:t xml:space="preserve"> </w:t>
+      </w:r>
+      <w:r>
+        <w:rPr>
           <w:rtl/>
         </w:rPr>
         <w:br/>
@@ -44,7 +51,47 @@
           <w:rFonts w:hint="cs"/>
           <w:rtl/>
         </w:rPr>
-        <w:t xml:space="preserve">לוח שנה חיפוש לפי תאריך לפי שם לקוחה לפי מוצרים </w:t>
+        <w:t>שם משתמש וסיסמא טוקנים</w:t>
+      </w:r>
+      <w:r>
+        <w:rPr>
+          <w:rtl/>
+        </w:rPr>
+        <w:br/>
+      </w:r>
+      <w:r>
+        <w:rPr>
+          <w:rFonts w:hint="cs"/>
+          <w:rtl/>
+        </w:rPr>
+        <w:t xml:space="preserve">אישור רק למנהל לפי ה </w:t>
+      </w:r>
+      <w:r>
+        <w:rPr>
+          <w:rFonts w:hint="cs"/>
+        </w:rPr>
+        <w:t xml:space="preserve">URL </w:t>
+      </w:r>
+      <w:r>
+        <w:rPr>
+          <w:rFonts w:hint="cs"/>
+          <w:rtl/>
+        </w:rPr>
+        <w:t xml:space="preserve"> שיהיה אפשרות רק למנה ל</w:t>
+      </w:r>
+      <w:r>
+        <w:rPr>
+          <w:rFonts w:hint="cs"/>
+          <w:rtl/>
+        </w:rPr>
+        <w:t xml:space="preserve"> </w:t>
+      </w:r>
+      <w:r>
+        <w:rPr>
+          <w:rFonts w:hint="cs"/>
+          <w:rtl/>
+        </w:rPr>
+        <w:t xml:space="preserve">להיכנס </w:t>
       </w:r>
       <w:proofErr w:type="spellStart"/>
       <w:r>
@@ -52,128 +99,15 @@
           <w:rFonts w:hint="cs"/>
           <w:rtl/>
         </w:rPr>
-        <w:t>הכל</w:t>
+        <w:t>להכל</w:t>
       </w:r>
       <w:proofErr w:type="spellEnd"/>
     </w:p>
     <w:p>
       <w:pPr>
         <w:rPr>
-          <w:rtl/>
-        </w:rPr>
-      </w:pPr>
-      <w:r>
-        <w:rPr>
-          <w:rFonts w:hint="cs"/>
-          <w:rtl/>
-        </w:rPr>
-        <w:t>שם משתמש וסיסמא טוקנים</w:t>
-      </w:r>
-      <w:r>
-        <w:rPr>
-          <w:rtl/>
-        </w:rPr>
-        <w:br/>
-      </w:r>
-      <w:r>
-        <w:rPr>
-          <w:rFonts w:hint="cs"/>
-          <w:rtl/>
-        </w:rPr>
-        <w:t xml:space="preserve">אישור רק למנהל לפי ה </w:t>
-      </w:r>
-      <w:r>
-        <w:rPr>
-          <w:rFonts w:hint="cs"/>
-        </w:rPr>
-        <w:t xml:space="preserve">URL </w:t>
-      </w:r>
-      <w:r>
-        <w:rPr>
-          <w:rFonts w:hint="cs"/>
-          <w:rtl/>
-        </w:rPr>
-        <w:t xml:space="preserve"> שיהיה אפשרות רק למנה </w:t>
-      </w:r>
-      <w:proofErr w:type="spellStart"/>
-      <w:r>
-        <w:rPr>
-          <w:rFonts w:hint="cs"/>
-          <w:rtl/>
-        </w:rPr>
-        <w:t>ללהיכנס</w:t>
-      </w:r>
-      <w:proofErr w:type="spellEnd"/>
-      <w:r>
-        <w:rPr>
-          <w:rFonts w:hint="cs"/>
-          <w:rtl/>
-        </w:rPr>
-        <w:t xml:space="preserve"> </w:t>
-      </w:r>
-      <w:proofErr w:type="spellStart"/>
-      <w:r>
-        <w:rPr>
-          <w:rFonts w:hint="cs"/>
-          <w:rtl/>
-        </w:rPr>
-        <w:t>להכל</w:t>
-      </w:r>
-      <w:proofErr w:type="spellEnd"/>
-    </w:p>
-    <w:p>
-      <w:pPr>
-        <w:rPr>
-          <w:rtl/>
-        </w:rPr>
-      </w:pPr>
-      <w:r>
-        <w:rPr>
-          <w:rtl/>
-        </w:rPr>
-        <w:br/>
-      </w:r>
-      <w:r>
-        <w:rPr>
-          <w:rFonts w:hint="cs"/>
-          <w:rtl/>
-        </w:rPr>
-        <w:t xml:space="preserve">להוסיף </w:t>
-      </w:r>
-      <w:proofErr w:type="spellStart"/>
-      <w:r>
-        <w:rPr>
-          <w:rFonts w:hint="cs"/>
-          <w:rtl/>
-        </w:rPr>
-        <w:t>אמפוליא</w:t>
-      </w:r>
-      <w:proofErr w:type="spellEnd"/>
-      <w:r>
-        <w:rPr>
-          <w:rFonts w:hint="cs"/>
-          <w:rtl/>
-        </w:rPr>
-        <w:t xml:space="preserve"> לסייד בר</w:t>
-      </w:r>
-    </w:p>
-    <w:p>
-      <w:pPr>
-        <w:rPr>
-          <w:rtl/>
-        </w:rPr>
-      </w:pPr>
-      <w:r>
-        <w:rPr>
-          <w:rFonts w:hint="cs"/>
-          <w:rtl/>
-        </w:rPr>
-        <w:t xml:space="preserve">כפתור חזרה </w:t>
-      </w:r>
-    </w:p>
-    <w:p>
-      <w:pPr>
-        <w:rPr>
+          <w:b/>
+          <w:bCs/>
           <w:rtl/>
         </w:rPr>
       </w:pPr>
@@ -189,36 +123,6 @@
           <w:rFonts w:hint="cs"/>
           <w:rtl/>
         </w:rPr>
-        <w:t xml:space="preserve">שיהיה אכיפה על מלאי  אם אין במלאי שלא </w:t>
-      </w:r>
-      <w:proofErr w:type="spellStart"/>
-      <w:r>
-        <w:rPr>
-          <w:rFonts w:hint="cs"/>
-          <w:rtl/>
-        </w:rPr>
-        <w:t>יתן</w:t>
-      </w:r>
-      <w:proofErr w:type="spellEnd"/>
-      <w:r>
-        <w:rPr>
-          <w:rFonts w:hint="cs"/>
-          <w:rtl/>
-        </w:rPr>
-        <w:t xml:space="preserve"> לקנות</w:t>
-      </w:r>
-    </w:p>
-    <w:p>
-      <w:pPr>
-        <w:rPr>
-          <w:rtl/>
-        </w:rPr>
-      </w:pPr>
-      <w:r>
-        <w:rPr>
-          <w:rFonts w:hint="cs"/>
-          <w:rtl/>
-        </w:rPr>
         <w:t xml:space="preserve">אבטחה </w:t>
       </w:r>
     </w:p>
@@ -235,54 +139,6 @@
           <w:rtl/>
         </w:rPr>
       </w:pPr>
-      <w:proofErr w:type="spellStart"/>
-      <w:r>
-        <w:rPr>
-          <w:rFonts w:hint="cs"/>
-          <w:rtl/>
-        </w:rPr>
-        <w:t>שיהיהי</w:t>
-      </w:r>
-      <w:proofErr w:type="spellEnd"/>
-      <w:r>
-        <w:rPr>
-          <w:rFonts w:hint="cs"/>
-          <w:rtl/>
-        </w:rPr>
-        <w:t xml:space="preserve"> לי 3 </w:t>
-      </w:r>
-      <w:proofErr w:type="spellStart"/>
-      <w:r>
-        <w:rPr>
-          <w:rFonts w:hint="cs"/>
-          <w:rtl/>
-        </w:rPr>
-        <w:t>אפשרויו</w:t>
-      </w:r>
-      <w:proofErr w:type="spellEnd"/>
-      <w:r>
-        <w:rPr>
-          <w:rFonts w:hint="cs"/>
-          <w:rtl/>
-        </w:rPr>
-        <w:t xml:space="preserve"> רכישת מצור רכישת פאה ושירות ואז ירד לי הסוג פריט ולפי זה הוא יביא את רשימת הפאות או את רשימת המוצרים בפריט ובשירות </w:t>
-      </w:r>
-      <w:proofErr w:type="spellStart"/>
-      <w:r>
-        <w:rPr>
-          <w:rFonts w:hint="cs"/>
-          <w:rtl/>
-        </w:rPr>
-        <w:t>שישאר</w:t>
-      </w:r>
-      <w:proofErr w:type="spellEnd"/>
-      <w:r>
-        <w:rPr>
-          <w:rFonts w:hint="cs"/>
-          <w:rtl/>
-        </w:rPr>
-        <w:t xml:space="preserve"> אות ודבר </w:t>
-      </w:r>
     </w:p>
     <w:p>
       <w:pPr>

</xml_diff>